<commit_message>
Lifts letter keeps its original subject; plot number as its own left-to-right run in Word
- «الموضوع / عدم وجود مصاعد» is never changed again; only the sentence
  «لا يحتوي / يحتوي على مصاعد كهربائية» follows the lifts input (v4).
- Word output: the plot number after the left-to-right mark is written as a run of
  its own without the right-to-left flag (still starting with the mark), the way
  Word stores mixed Arabic / number text.

Co-Authored-By: Claude Opus 5.5 <noreply@anthropic.com>
Claude-Session: https://claude.ai/code/session_01KhB95Q3CdNoHoGHNq4XQ7x
</commit_message>
<xml_diff>
--- a/templates/dist/no-elevators.docx
+++ b/templates/dist/no-elevators.docx
@@ -309,39 +309,7 @@
           <w:rtl/>
           <w:lang w:bidi="ar-AE"/>
         </w:rPr>
-        <w:t xml:space="preserve"/>
-      </w:r>
-      <w:r>
-        <w:rPr>
-          <w:rFonts w:ascii="DINArabic-Black" w:hAnsi="DINArabic-Black" w:cs="DINArabic-Black" w:eastAsia="DINArabic-Black"/>
-          <w:rtl/>
-          <w:lang w:bidi="ar-AE"/>
-          <w:color w:val="FFFFFF"/>
-          <w:spacing w:val="-20"/>
-          <w:sz w:val="2"/>
-          <w:szCs w:val="2"/>
-        </w:rPr>
-        <w:t xml:space="preserve">QZ6ZQ</w:t>
-      </w:r>
-      <w:r>
-        <w:rPr>
-          <w:rFonts w:ascii="DINArabic-Black" w:hAnsi="DINArabic-Black" w:cs="DINArabic-Black" w:hint="cs"/>
-          <w:sz w:val="32"/>
-          <w:szCs w:val="32"/>
-          <w:rtl/>
-          <w:lang w:bidi="ar-AE"/>
-        </w:rPr>
-        <w:t xml:space="preserve">        </w:t>
-      </w:r>
-      <w:r>
-        <w:rPr>
-          <w:rFonts w:ascii="DINArabic-Black" w:hAnsi="DINArabic-Black" w:cs="DINArabic-Black" w:hint="cs"/>
-          <w:sz w:val="32"/>
-          <w:szCs w:val="32"/>
-          <w:rtl/>
-          <w:lang w:bidi="ar-AE"/>
-        </w:rPr>
-        <w:t xml:space="preserve"> </w:t>
+        <w:t xml:space="preserve">عدم وجود </w:t>
       </w:r>
       <w:r>
         <w:rPr>
@@ -802,7 +770,7 @@
           <w:sz w:val="2"/>
           <w:szCs w:val="2"/>
         </w:rPr>
-        <w:t xml:space="preserve">QZ7ZQ</w:t>
+        <w:t xml:space="preserve">QZ6ZQ</w:t>
       </w:r>
       <w:r>
         <w:rPr>
@@ -1100,7 +1068,7 @@
           <w:sz w:val="32"/>
           <w:color w:val="FFFFFF"/>
         </w:rPr>
-        <w:t xml:space="preserve">QZ8ZQ</w:t>
+        <w:t xml:space="preserve">QZ7ZQ</w:t>
       </w:r>
     </w:p>
     <w:sectPr>

</xml_diff>